<commit_message>
Rebuild 2-page report PDF and docx from PROJECT_REPORT_2PAGE.md; remove stale duplicate PDF
</commit_message>
<xml_diff>
--- a/docs/ClearCut_Report_2pages.docx
+++ b/docs/ClearCut_Report_2pages.docx
@@ -4,64 +4,43 @@
   <w:body>
     <w:p>
       <w:pPr>
-        <w:spacing w:after="20"/>
+        <w:spacing w:before="0"/>
+      </w:pPr>
+      <w:r>
+        <w:rPr>
+          <w:b w:val="0"/>
+          <w:i w:val="0"/>
+          <w:sz w:val="19"/>
+        </w:rPr>
+        <w:t>﻿# ClearCut: Spoiler-Free Rewriting of Movie and TV Reviews</w:t>
+      </w:r>
+    </w:p>
+    <w:p>
+      <w:pPr>
+        <w:spacing w:before="0" w:after="60"/>
         <w:jc w:val="center"/>
       </w:pPr>
       <w:r>
         <w:rPr>
           <w:b/>
           <w:i w:val="0"/>
-          <w:color w:val="1F3A5F"/>
-          <w:sz w:val="30"/>
+          <w:sz w:val="19"/>
         </w:rPr>
-        <w:t>ClearCut: Rule-Based Spoiler-Free Rewriting of Movie and Series Reviews</w:t>
+        <w:t>Code:</w:t>
+      </w:r>
+      <w:r>
+        <w:rPr>
+          <w:b w:val="0"/>
+          <w:i w:val="0"/>
+          <w:sz w:val="19"/>
+        </w:rPr>
+        <w:t xml:space="preserve"> https://github.com/tejeshwar20/clearcut</w:t>
       </w:r>
     </w:p>
     <w:p>
       <w:pPr>
-        <w:spacing w:after="20"/>
-        <w:jc w:val="center"/>
-      </w:pPr>
-      <w:r>
-        <w:rPr>
-          <w:b w:val="0"/>
-          <w:i/>
-          <w:sz w:val="20"/>
-        </w:rPr>
-        <w:t>Natural Language Processing Project Report</w:t>
-      </w:r>
-    </w:p>
-    <w:p>
-      <w:pPr>
-        <w:spacing w:after="20"/>
-        <w:jc w:val="center"/>
-      </w:pPr>
-      <w:r>
-        <w:rPr>
-          <w:b w:val="0"/>
-          <w:i w:val="0"/>
-          <w:sz w:val="18"/>
-        </w:rPr>
-        <w:t>Tejeshwar  |  [Roll number, programme, institution]  |  Submitted to: [Professor, department]  |  23 October 2026</w:t>
-      </w:r>
-    </w:p>
-    <w:p>
-      <w:pPr>
-        <w:spacing w:after="60"/>
-        <w:jc w:val="center"/>
-      </w:pPr>
-      <w:r>
-        <w:rPr>
-          <w:b w:val="0"/>
-          <w:i w:val="0"/>
-          <w:sz w:val="18"/>
-        </w:rPr>
-        <w:t>Code: https://github.com/tejeshwar20/clearcut</w:t>
-      </w:r>
-    </w:p>
-    <w:p>
-      <w:pPr>
-        <w:spacing w:after="40" w:before="100"/>
+        <w:keepNext/>
+        <w:spacing w:before="100" w:after="40"/>
         <w:pBdr>
           <w:bottom w:val="single" w:sz="4" w:space="1" w:color="1F3A5F"/>
         </w:pBdr>
@@ -73,21 +52,39 @@
           <w:color w:val="1F3A5F"/>
           <w:sz w:val="23"/>
         </w:rPr>
-        <w:t>Abstract</w:t>
+        <w:t>1. Abstract</w:t>
       </w:r>
     </w:p>
     <w:p>
+      <w:pPr>
+        <w:spacing w:before="0"/>
+      </w:pPr>
       <w:r>
         <w:rPr>
           <w:b w:val="0"/>
           <w:i w:val="0"/>
+          <w:sz w:val="19"/>
         </w:rPr>
-        <w:t>Reviews often reveal plot twists, deaths and endings. ClearCut is a web application that takes a pasted English review and returns the same review with only the spoiler sentences rewritten; every other sentence is kept word for word. It is a rule-based NLP pipeline: spaCy dependency parsing decides how much of a sentence to remove, curated pattern sets detect plot disclosures, and a rewriting step keeps the reviewer's reaction while replacing the revealed fact with a neutral phrase. A final check withholds the output if any disclosure remains. On developer-written tests the system leaked 0 of 25 spoilers, changed 0 of 20 harmless sentences, kept 48 of 48 harmless sentences around a spoiler, and responded in about 20 ms (short) to 130 ms (300 words). These tests are not an independent benchmark.</w:t>
+        <w:t>Movie and TV reviews often reveal twists, deaths and endings, so a reader who only wants to know whether a film is worth watching can end up spoiled. ClearCut is a web application that takes one or more pasted English reviews and returns a spoiler-free version, together with a short verdict by aspect (overall impression, acting, story and writing, pacing, visuals and characters). Only the sentences that disclose plot are rewritten. Every other sentence is kept exactly as the reviewer wrote it, so the reviewer's opinion and voice are preserved.</w:t>
       </w:r>
     </w:p>
     <w:p>
       <w:pPr>
-        <w:spacing w:after="40" w:before="100"/>
+        <w:spacing w:before="0"/>
+      </w:pPr>
+      <w:r>
+        <w:rPr>
+          <w:b w:val="0"/>
+          <w:i w:val="0"/>
+          <w:sz w:val="19"/>
+        </w:rPr>
+        <w:t>The system is a rule-based NLP pipeline built from sentence splitting, curated spoiler cue patterns, a spaCy dependency parse, VADER sentiment and TF-IDF sentence selection. A final safety check re-scans the output and withholds it if any disclosure remains. It runs locally with no API key and responds in about 20 ms for a short review. On developer-written test cases it removed most spoilers and left harmless text unchanged.</w:t>
+      </w:r>
+    </w:p>
+    <w:p>
+      <w:pPr>
+        <w:keepNext/>
+        <w:spacing w:before="100" w:after="40"/>
         <w:pBdr>
           <w:bottom w:val="single" w:sz="4" w:space="1" w:color="1F3A5F"/>
         </w:pBdr>
@@ -99,21 +96,52 @@
           <w:color w:val="1F3A5F"/>
           <w:sz w:val="23"/>
         </w:rPr>
-        <w:t>1. Introduction</w:t>
+        <w:t>2. Introduction</w:t>
       </w:r>
     </w:p>
     <w:p>
+      <w:pPr>
+        <w:spacing w:before="0"/>
+      </w:pPr>
       <w:r>
         <w:rPr>
           <w:b w:val="0"/>
           <w:i w:val="0"/>
+          <w:sz w:val="19"/>
         </w:rPr>
-        <w:t>Readers who want a reviewer's opinion but not the plot have few options. Sites offer spoiler tags, and extensions blur keyword matches, but both hide the opinion along with the plot. ClearCut instead rewrites the spoiler and keeps the opinion. For example, “Great visuals. It was all a simulation the whole time, which blew my mind.” becomes “Great visuals. The big surprise blew my mind.” The reviewer's reaction survives and the revealed fact does not.</w:t>
+        <w:t>People read reviews to decide what to watch, and they want the reviewer's judgement of the acting, story, pacing and visuals. Many reviews also describe what happens: who dies, who the villain really is, how it ends. Once a reader has seen that, it cannot be undone. Spoiler tags exist on some sites, but they are optional, inconsistent and left to the reviewer, and many reviews have none.</w:t>
       </w:r>
     </w:p>
     <w:p>
       <w:pPr>
-        <w:spacing w:after="40" w:before="100"/>
+        <w:spacing w:before="0"/>
+      </w:pPr>
+      <w:r>
+        <w:rPr>
+          <w:b w:val="0"/>
+          <w:i w:val="0"/>
+          <w:sz w:val="19"/>
+        </w:rPr>
+        <w:t>The obvious fix is to delete flagged sentences or hide the whole review. That solves the spoiler problem but removes the opinion with it. A sentence such as "The ending, where the hero dies saving his village, was beautifully acted" contains both a spoiler and praise. Dropping it loses the praise, while keeping it reveals the death.</w:t>
+      </w:r>
+    </w:p>
+    <w:p>
+      <w:pPr>
+        <w:spacing w:before="0"/>
+      </w:pPr>
+      <w:r>
+        <w:rPr>
+          <w:b w:val="0"/>
+          <w:i w:val="0"/>
+          <w:sz w:val="19"/>
+        </w:rPr>
+        <w:t>ClearCut takes a middle path. It detects the sentence that discloses plot, replaces only the revealed fact with a neutral phrase, and keeps the reviewer's reaction. Harmless sentences are not touched. The aspect verdict then summarises what the review says about each part of the film. The rest of this report states the problem, describes the approach, reports how it was tested (including where it failed), and lists the data used.</w:t>
+      </w:r>
+    </w:p>
+    <w:p>
+      <w:pPr>
+        <w:keepNext/>
+        <w:spacing w:before="100" w:after="40"/>
         <w:pBdr>
           <w:bottom w:val="single" w:sz="4" w:space="1" w:color="1F3A5F"/>
         </w:pBdr>
@@ -125,63 +153,194 @@
           <w:color w:val="1F3A5F"/>
           <w:sz w:val="23"/>
         </w:rPr>
-        <w:t>2. Problem statement</w:t>
+        <w:t>3. Problem Statement</w:t>
       </w:r>
     </w:p>
     <w:p>
+      <w:pPr>
+        <w:spacing w:before="0"/>
+      </w:pPr>
       <w:r>
         <w:rPr>
           <w:b w:val="0"/>
           <w:i w:val="0"/>
+          <w:sz w:val="19"/>
         </w:rPr>
-        <w:t xml:space="preserve">Given a free-text review, produce a version that </w:t>
+        <w:t>Online reviews are the main way people decide what to watch, but many of them reveal plot twists, character deaths and endings. Spoiler tags are optional and depend on the reviewer, and many reviews have none. Deleting a whole flagged review, or a whole flagged sentence, also throws away the reviewer's opinion, which is the part the reader actually wants. Readers are left choosing between being spoiled and not reading reviews at all.</w:t>
+      </w:r>
+    </w:p>
+    <w:p>
+      <w:pPr>
+        <w:spacing w:before="0"/>
+      </w:pPr>
+      <w:r>
+        <w:rPr>
+          <w:b/>
+          <w:i w:val="0"/>
+          <w:sz w:val="19"/>
+        </w:rPr>
+        <w:t>Problem:</w:t>
+      </w:r>
+      <w:r>
+        <w:rPr>
+          <w:b w:val="0"/>
+          <w:i w:val="0"/>
+          <w:sz w:val="19"/>
+        </w:rPr>
+        <w:t xml:space="preserve"> given one or more raw English reviews of a movie or TV show, automatically produce a version that</w:t>
+      </w:r>
+    </w:p>
+    <w:p>
+      <w:pPr>
+        <w:spacing w:before="0" w:after="20"/>
+        <w:ind w:left="397" w:hanging="283"/>
+      </w:pPr>
+      <w:r>
+        <w:rPr>
+          <w:b w:val="0"/>
+          <w:i w:val="0"/>
+          <w:sz w:val="19"/>
+        </w:rPr>
+        <w:t>1.</w:t>
+        <w:tab/>
+        <w:t xml:space="preserve">contains </w:t>
       </w:r>
       <w:r>
         <w:rPr>
           <w:b/>
           <w:i w:val="0"/>
+          <w:sz w:val="19"/>
         </w:rPr>
-        <w:t>(a)</w:t>
+        <w:t>no plot disclosures</w:t>
       </w:r>
       <w:r>
         <w:rPr>
           <w:b w:val="0"/>
           <w:i w:val="0"/>
+          <w:sz w:val="19"/>
         </w:rPr>
-        <w:t xml:space="preserve"> discloses no plot information, </w:t>
+        <w:t xml:space="preserve"> (identity reveals, deaths, twists, endings);</w:t>
+      </w:r>
+    </w:p>
+    <w:p>
+      <w:pPr>
+        <w:spacing w:before="0" w:after="20"/>
+        <w:ind w:left="397" w:hanging="283"/>
+      </w:pPr>
+      <w:r>
+        <w:rPr>
+          <w:b w:val="0"/>
+          <w:i w:val="0"/>
+          <w:sz w:val="19"/>
+        </w:rPr>
+        <w:t>2.</w:t>
+        <w:tab/>
       </w:r>
       <w:r>
         <w:rPr>
           <w:b/>
           <w:i w:val="0"/>
+          <w:sz w:val="19"/>
         </w:rPr>
-        <w:t>(b)</w:t>
+        <w:t>keeps the reviewer's opinion</w:t>
       </w:r>
       <w:r>
         <w:rPr>
           <w:b w:val="0"/>
           <w:i w:val="0"/>
+          <w:sz w:val="19"/>
         </w:rPr>
-        <w:t xml:space="preserve"> keeps every sentence that does not disclose plot exactly as written, and </w:t>
+        <w:t xml:space="preserve"> and leaves harmless sentences exactly as written;</w:t>
+      </w:r>
+    </w:p>
+    <w:p>
+      <w:pPr>
+        <w:spacing w:before="0" w:after="20"/>
+        <w:ind w:left="397" w:hanging="283"/>
+      </w:pPr>
+      <w:r>
+        <w:rPr>
+          <w:b w:val="0"/>
+          <w:i w:val="0"/>
+          <w:sz w:val="19"/>
+        </w:rPr>
+        <w:t>3.</w:t>
+        <w:tab/>
+        <w:t xml:space="preserve">gives a short, readable </w:t>
       </w:r>
       <w:r>
         <w:rPr>
           <w:b/>
           <w:i w:val="0"/>
+          <w:sz w:val="19"/>
         </w:rPr>
-        <w:t>(c)</w:t>
+        <w:t>verdict by aspect</w:t>
       </w:r>
       <w:r>
         <w:rPr>
           <w:b w:val="0"/>
           <w:i w:val="0"/>
+          <w:sz w:val="19"/>
         </w:rPr>
-        <w:t xml:space="preserve"> keeps the reviewer's reaction wherever this is safe. Existing spoiler-detection research mostly labels text as spoiler / not spoiler; this project goes further and rewrites the text, under the strict constraint that harmless text is never altered.</w:t>
+        <w:t xml:space="preserve"> (overall impression, acting, story and writing, pacing, visuals, characters); and</w:t>
       </w:r>
     </w:p>
     <w:p>
       <w:pPr>
-        <w:spacing w:after="40" w:before="100"/>
+        <w:spacing w:before="0" w:after="20"/>
+        <w:ind w:left="397" w:hanging="283"/>
+      </w:pPr>
+      <w:r>
+        <w:rPr>
+          <w:b w:val="0"/>
+          <w:i w:val="0"/>
+          <w:sz w:val="19"/>
+        </w:rPr>
+        <w:t>4.</w:t>
+        <w:tab/>
+      </w:r>
+      <w:r>
+        <w:rPr>
+          <w:b/>
+          <w:i w:val="0"/>
+          <w:sz w:val="19"/>
+        </w:rPr>
+        <w:t>fails safe</w:t>
+      </w:r>
+      <w:r>
+        <w:rPr>
+          <w:b w:val="0"/>
+          <w:i w:val="0"/>
+          <w:sz w:val="19"/>
+        </w:rPr>
+        <w:t>: if a disclosure cannot be removed with confidence, the text is withheld rather than shown, because a leaked spoiler is the worst failure.</w:t>
+      </w:r>
+    </w:p>
+    <w:p>
+      <w:pPr>
+        <w:spacing w:before="0"/>
+      </w:pPr>
+      <w:r>
+        <w:rPr>
+          <w:b/>
+          <w:i w:val="0"/>
+          <w:sz w:val="19"/>
+        </w:rPr>
+        <w:t>Challenges:</w:t>
+      </w:r>
+      <w:r>
+        <w:rPr>
+          <w:b w:val="0"/>
+          <w:i w:val="0"/>
+          <w:sz w:val="19"/>
+        </w:rPr>
+        <w:t xml:space="preserve"> spoilers are expressed in many ways ("Darth Vader is Luke's father", "it was all a simulation", "he doesn't make it") and usually share no keyword with the harmless text around them. Removing too much destroys the review, and removing too little leaks the plot. No large labelled spoiler dataset is available for this kind of rewriting, so the system must work without one and be measured honestly.</w:t>
+      </w:r>
+    </w:p>
+    <w:p>
+      <w:pPr>
+        <w:keepNext/>
+        <w:spacing w:before="100" w:after="40"/>
         <w:pBdr>
           <w:bottom w:val="single" w:sz="4" w:space="1" w:color="1F3A5F"/>
         </w:pBdr>
@@ -193,235 +352,139 @@
           <w:color w:val="1F3A5F"/>
           <w:sz w:val="23"/>
         </w:rPr>
-        <w:t>3. Solution approach</w:t>
+        <w:t>4. Solution Approach</w:t>
       </w:r>
     </w:p>
     <w:p>
       <w:pPr>
-        <w:spacing w:after="40"/>
+        <w:spacing w:before="0"/>
       </w:pPr>
-      <w:r>
-        <w:rPr>
-          <w:b/>
-          <w:i w:val="0"/>
-        </w:rPr>
-        <w:t>Model.</w:t>
-      </w:r>
       <w:r>
         <w:rPr>
           <w:b w:val="0"/>
           <w:i w:val="0"/>
+          <w:sz w:val="19"/>
         </w:rPr>
-        <w:t xml:space="preserve"> There is no trained model. A transparent rule-based pipeline was chosen because no labelled spoiler data was available, because “other sentences stay identical” is easy to guarantee with rules but not with a generative model, and because every decision can be traced to a named pattern. It runs offline and needs no API key.</w:t>
-      </w:r>
-    </w:p>
-    <w:tbl>
-      <w:tblPr>
-        <w:tblW w:type="auto" w:w="0"/>
-        <w:jc w:val="center"/>
-        <w:tblLook w:firstColumn="1" w:firstRow="1" w:lastColumn="0" w:lastRow="0" w:noHBand="0" w:noVBand="1" w:val="04A0"/>
-      </w:tblPr>
-      <w:tblGrid>
-        <w:gridCol w:w="1393"/>
-        <w:gridCol w:w="1393"/>
-        <w:gridCol w:w="1393"/>
-        <w:gridCol w:w="1393"/>
-        <w:gridCol w:w="1393"/>
-        <w:gridCol w:w="1393"/>
-        <w:gridCol w:w="1393"/>
-      </w:tblGrid>
-      <w:tr>
-        <w:tc>
-          <w:tcPr>
-            <w:tcW w:type="dxa" w:w="1393"/>
-            <w:shd w:val="clear" w:color="auto" w:fill="E8F0E4"/>
-          </w:tcPr>
-          <w:p>
-            <w:pPr>
-              <w:spacing w:after="0"/>
-              <w:jc w:val="center"/>
-            </w:pPr>
-            <w:r/>
-            <w:r>
-              <w:rPr>
-                <w:b/>
-                <w:sz w:val="15"/>
-              </w:rPr>
-              <w:t>Pasted review  →</w:t>
-            </w:r>
-          </w:p>
-        </w:tc>
-        <w:tc>
-          <w:tcPr>
-            <w:tcW w:type="dxa" w:w="1393"/>
-            <w:shd w:val="clear" w:color="auto" w:fill="DCE6F1"/>
-          </w:tcPr>
-          <w:p>
-            <w:pPr>
-              <w:spacing w:after="0"/>
-              <w:jc w:val="center"/>
-            </w:pPr>
-            <w:r/>
-            <w:r>
-              <w:rPr>
-                <w:b/>
-                <w:sz w:val="15"/>
-              </w:rPr>
-              <w:t>Parse (spaCy)  →</w:t>
-            </w:r>
-          </w:p>
-        </w:tc>
-        <w:tc>
-          <w:tcPr>
-            <w:tcW w:type="dxa" w:w="1393"/>
-            <w:shd w:val="clear" w:color="auto" w:fill="DCE6F1"/>
-          </w:tcPr>
-          <w:p>
-            <w:pPr>
-              <w:spacing w:after="0"/>
-              <w:jc w:val="center"/>
-            </w:pPr>
-            <w:r/>
-            <w:r>
-              <w:rPr>
-                <w:b/>
-                <w:sz w:val="15"/>
-              </w:rPr>
-              <w:t>Detect spoiler cues  →</w:t>
-            </w:r>
-          </w:p>
-        </w:tc>
-        <w:tc>
-          <w:tcPr>
-            <w:tcW w:type="dxa" w:w="1393"/>
-            <w:shd w:val="clear" w:color="auto" w:fill="DCE6F1"/>
-          </w:tcPr>
-          <w:p>
-            <w:pPr>
-              <w:spacing w:after="0"/>
-              <w:jc w:val="center"/>
-            </w:pPr>
-            <w:r/>
-            <w:r>
-              <w:rPr>
-                <w:b/>
-                <w:sz w:val="15"/>
-              </w:rPr>
-              <w:t>Keep / cut / rewrite  →</w:t>
-            </w:r>
-          </w:p>
-        </w:tc>
-        <w:tc>
-          <w:tcPr>
-            <w:tcW w:type="dxa" w:w="1393"/>
-            <w:shd w:val="clear" w:color="auto" w:fill="DCE6F1"/>
-          </w:tcPr>
-          <w:p>
-            <w:pPr>
-              <w:spacing w:after="0"/>
-              <w:jc w:val="center"/>
-            </w:pPr>
-            <w:r/>
-            <w:r>
-              <w:rPr>
-                <w:b/>
-                <w:sz w:val="15"/>
-              </w:rPr>
-              <w:t>Rewrite reaction  →</w:t>
-            </w:r>
-          </w:p>
-        </w:tc>
-        <w:tc>
-          <w:tcPr>
-            <w:tcW w:type="dxa" w:w="1393"/>
-            <w:shd w:val="clear" w:color="auto" w:fill="DCE6F1"/>
-          </w:tcPr>
-          <w:p>
-            <w:pPr>
-              <w:spacing w:after="0"/>
-              <w:jc w:val="center"/>
-            </w:pPr>
-            <w:r/>
-            <w:r>
-              <w:rPr>
-                <w:b/>
-                <w:sz w:val="15"/>
-              </w:rPr>
-              <w:t>Safety check  →</w:t>
-            </w:r>
-          </w:p>
-        </w:tc>
-        <w:tc>
-          <w:tcPr>
-            <w:tcW w:type="dxa" w:w="1393"/>
-            <w:shd w:val="clear" w:color="auto" w:fill="E8F0E4"/>
-          </w:tcPr>
-          <w:p>
-            <w:pPr>
-              <w:spacing w:after="0"/>
-              <w:jc w:val="center"/>
-            </w:pPr>
-            <w:r/>
-            <w:r>
-              <w:rPr>
-                <w:b/>
-                <w:sz w:val="15"/>
-              </w:rPr>
-              <w:t>Spoiler-free review</w:t>
-            </w:r>
-          </w:p>
-        </w:tc>
-      </w:tr>
-    </w:tbl>
-    <w:p>
-      <w:pPr>
-        <w:spacing w:after="0"/>
-      </w:pPr>
-    </w:p>
-    <w:p>
-      <w:pPr>
-        <w:spacing w:after="60"/>
-      </w:pPr>
-      <w:r>
-        <w:rPr>
-          <w:b/>
-          <w:i/>
-          <w:sz w:val="17"/>
-        </w:rPr>
-        <w:t>Figure 1.</w:t>
-      </w:r>
-      <w:r>
-        <w:rPr>
-          <w:b w:val="0"/>
-          <w:i/>
-          <w:sz w:val="17"/>
-        </w:rPr>
-        <w:t xml:space="preserve"> Processing pipeline. Sentences with no spoiler cue skip straight through unchanged.</w:t>
-      </w:r>
-    </w:p>
-    <w:p>
-      <w:pPr>
-        <w:spacing w:after="20"/>
-      </w:pPr>
-      <w:r>
-        <w:rPr>
-          <w:b/>
-          <w:i w:val="0"/>
-        </w:rPr>
-        <w:t>Pipeline</w:t>
-      </w:r>
-      <w:r>
-        <w:rPr>
-          <w:b w:val="0"/>
-          <w:i w:val="0"/>
-        </w:rPr>
-        <w:t xml:space="preserve"> (spaCy 3.8 </w:t>
+        <w:t xml:space="preserve">The system is a pipeline in </w:t>
       </w:r>
       <w:r>
         <w:rPr>
           <w:rFonts w:ascii="Consolas" w:hAnsi="Consolas" w:eastAsia="Consolas"/>
           <w:b w:val="0"/>
           <w:i w:val="0"/>
+          <w:sz w:val="18"/>
+        </w:rPr>
+        <w:t>pipeline.py</w:t>
+      </w:r>
+      <w:r>
+        <w:rPr>
+          <w:b w:val="0"/>
+          <w:i w:val="0"/>
+          <w:sz w:val="19"/>
+        </w:rPr>
+        <w:t xml:space="preserve"> and </w:t>
+      </w:r>
+      <w:r>
+        <w:rPr>
+          <w:rFonts w:ascii="Consolas" w:hAnsi="Consolas" w:eastAsia="Consolas"/>
+          <w:b w:val="0"/>
+          <w:i w:val="0"/>
+          <w:sz w:val="18"/>
+        </w:rPr>
+        <w:t>source_writer.py</w:t>
+      </w:r>
+      <w:r>
+        <w:rPr>
+          <w:b w:val="0"/>
+          <w:i w:val="0"/>
+          <w:sz w:val="19"/>
+        </w:rPr>
+        <w:t>:</w:t>
+      </w:r>
+    </w:p>
+    <w:p>
+      <w:pPr>
+        <w:spacing w:before="0" w:after="20"/>
+        <w:ind w:left="397" w:hanging="283"/>
+      </w:pPr>
+      <w:r>
+        <w:rPr>
+          <w:b w:val="0"/>
+          <w:i w:val="0"/>
+          <w:sz w:val="19"/>
+        </w:rPr>
+        <w:t>1.</w:t>
+        <w:tab/>
+      </w:r>
+      <w:r>
+        <w:rPr>
+          <w:b/>
+          <w:i w:val="0"/>
+          <w:sz w:val="19"/>
+        </w:rPr>
+        <w:t>Preprocessing:</w:t>
+      </w:r>
+      <w:r>
+        <w:rPr>
+          <w:b w:val="0"/>
+          <w:i w:val="0"/>
+          <w:sz w:val="19"/>
+        </w:rPr>
+        <w:t xml:space="preserve"> input validation, Unicode normalisation, and sentence splitting with NLTK Punkt.</w:t>
+      </w:r>
+    </w:p>
+    <w:p>
+      <w:pPr>
+        <w:spacing w:before="0" w:after="20"/>
+        <w:ind w:left="397" w:hanging="283"/>
+      </w:pPr>
+      <w:r>
+        <w:rPr>
+          <w:b w:val="0"/>
+          <w:i w:val="0"/>
+          <w:sz w:val="19"/>
+        </w:rPr>
+        <w:t>2.</w:t>
+        <w:tab/>
+      </w:r>
+      <w:r>
+        <w:rPr>
+          <w:b/>
+          <w:i w:val="0"/>
+          <w:sz w:val="19"/>
+        </w:rPr>
+        <w:t>Spoiler detection:</w:t>
+      </w:r>
+      <w:r>
+        <w:rPr>
+          <w:b w:val="0"/>
+          <w:i w:val="0"/>
+          <w:sz w:val="19"/>
+        </w:rPr>
+        <w:t xml:space="preserve"> curated cue patterns for identity reveals, deaths and fates, "the whole time" twists, dream or simulation twists, betrayal, faked events, endings and explicit "Spoiler:" markers. These are combined with a </w:t>
+      </w:r>
+      <w:r>
+        <w:rPr>
+          <w:b/>
+          <w:i w:val="0"/>
+          <w:sz w:val="19"/>
+        </w:rPr>
+        <w:t>spaCy dependency parse</w:t>
+      </w:r>
+      <w:r>
+        <w:rPr>
+          <w:b w:val="0"/>
+          <w:i w:val="0"/>
+          <w:sz w:val="19"/>
+        </w:rPr>
+        <w:t xml:space="preserve"> (</w:t>
+      </w:r>
+      <w:r>
+        <w:rPr>
+          <w:rFonts w:ascii="Consolas" w:hAnsi="Consolas" w:eastAsia="Consolas"/>
+          <w:b w:val="0"/>
+          <w:i w:val="0"/>
+          <w:sz w:val="18"/>
         </w:rPr>
         <w:t>en_core_web_sm</w:t>
       </w:r>
@@ -429,147 +492,129 @@
         <w:rPr>
           <w:b w:val="0"/>
           <w:i w:val="0"/>
+          <w:sz w:val="19"/>
         </w:rPr>
-        <w:t>, regular expressions, VADER 3.3.2, Flask/Waitress):</w:t>
+        <w:t>) to decide how much of a sentence to remove.</w:t>
       </w:r>
     </w:p>
     <w:p>
       <w:pPr>
-        <w:pStyle w:val="ListBullet"/>
-        <w:spacing w:after="20"/>
-        <w:ind w:left="312"/>
+        <w:spacing w:before="0" w:after="20"/>
+        <w:ind w:left="397" w:hanging="283"/>
+      </w:pPr>
+      <w:r>
+        <w:rPr>
+          <w:b w:val="0"/>
+          <w:i w:val="0"/>
+          <w:sz w:val="19"/>
+        </w:rPr>
+        <w:t>3.</w:t>
+        <w:tab/>
+      </w:r>
+      <w:r>
+        <w:rPr>
+          <w:b/>
+          <w:i w:val="0"/>
+          <w:sz w:val="19"/>
+        </w:rPr>
+        <w:t>Rewriting:</w:t>
+      </w:r>
+      <w:r>
+        <w:rPr>
+          <w:b w:val="0"/>
+          <w:i w:val="0"/>
+          <w:sz w:val="19"/>
+        </w:rPr>
+        <w:t xml:space="preserve"> the reviewer's reaction is kept and the revealed fact is replaced with a neutral phrase. For example, "In the end the hero dies saving his village" becomes "The ending is best experienced without knowing what's coming."</w:t>
+      </w:r>
+    </w:p>
+    <w:p>
+      <w:pPr>
+        <w:spacing w:before="0" w:after="20"/>
+        <w:ind w:left="397" w:hanging="283"/>
+      </w:pPr>
+      <w:r>
+        <w:rPr>
+          <w:b w:val="0"/>
+          <w:i w:val="0"/>
+          <w:sz w:val="19"/>
+        </w:rPr>
+        <w:t>4.</w:t>
+        <w:tab/>
+      </w:r>
+      <w:r>
+        <w:rPr>
+          <w:b/>
+          <w:i w:val="0"/>
+          <w:sz w:val="19"/>
+        </w:rPr>
+        <w:t>Sentence selection:</w:t>
+      </w:r>
+      <w:r>
+        <w:rPr>
+          <w:b w:val="0"/>
+          <w:i w:val="0"/>
+          <w:sz w:val="19"/>
+        </w:rPr>
+        <w:t xml:space="preserve"> TF-IDF and cosine similarity choose diverse, non-redundant sentences when several reviews are combined.</w:t>
+      </w:r>
+    </w:p>
+    <w:p>
+      <w:pPr>
+        <w:spacing w:before="0" w:after="20"/>
+        <w:ind w:left="397" w:hanging="283"/>
+      </w:pPr>
+      <w:r>
+        <w:rPr>
+          <w:b w:val="0"/>
+          <w:i w:val="0"/>
+          <w:sz w:val="19"/>
+        </w:rPr>
+        <w:t>5.</w:t>
+        <w:tab/>
+      </w:r>
+      <w:r>
+        <w:rPr>
+          <w:b/>
+          <w:i w:val="0"/>
+          <w:sz w:val="19"/>
+        </w:rPr>
+        <w:t>Final safety check:</w:t>
+      </w:r>
+      <w:r>
+        <w:rPr>
+          <w:b w:val="0"/>
+          <w:i w:val="0"/>
+          <w:sz w:val="19"/>
+        </w:rPr>
+        <w:t xml:space="preserve"> the output is re-scanned and withheld if any disclosure remains.</w:t>
+      </w:r>
+    </w:p>
+    <w:p>
+      <w:pPr>
+        <w:spacing w:before="0"/>
       </w:pPr>
       <w:r>
         <w:rPr>
           <w:b/>
           <w:i w:val="0"/>
-          <w:sz w:val="20"/>
+          <w:sz w:val="19"/>
         </w:rPr>
-        <w:t>Parse:</w:t>
+        <w:t>Stack:</w:t>
       </w:r>
       <w:r>
         <w:rPr>
           <w:b w:val="0"/>
           <w:i w:val="0"/>
-          <w:sz w:val="20"/>
+          <w:sz w:val="19"/>
         </w:rPr>
-        <w:t xml:space="preserve"> split into sentences; obtain part-of-speech tags, lemmas and the dependency tree.</w:t>
+        <w:t xml:space="preserve"> Python, Flask, spaCy, NLTK, scikit-learn, VADER, Waitress, and a plain HTML/JS front end.</w:t>
       </w:r>
     </w:p>
     <w:p>
       <w:pPr>
-        <w:pStyle w:val="ListBullet"/>
-        <w:spacing w:after="20"/>
-        <w:ind w:left="312"/>
-      </w:pPr>
-      <w:r>
-        <w:rPr>
-          <w:b/>
-          <w:i w:val="0"/>
-          <w:sz w:val="20"/>
-        </w:rPr>
-        <w:t>Detect:</w:t>
-      </w:r>
-      <w:r>
-        <w:rPr>
-          <w:b w:val="0"/>
-          <w:i w:val="0"/>
-          <w:sz w:val="20"/>
-        </w:rPr>
-        <w:t xml:space="preserve"> match five cue sets – events (deaths, betrayals), reveals (“turns out”, “the climax”), hidden reveals (identity and family reveals, “all along”, dream or simulation twists, “Spoiler:”), outcomes, and character fates. Genre labels such as “revenge thriller” are exempt.</w:t>
-      </w:r>
-    </w:p>
-    <w:p>
-      <w:pPr>
-        <w:pStyle w:val="ListBullet"/>
-        <w:spacing w:after="20"/>
-        <w:ind w:left="312"/>
-      </w:pPr>
-      <w:r>
-        <w:rPr>
-          <w:b/>
-          <w:i w:val="0"/>
-          <w:sz w:val="20"/>
-        </w:rPr>
-        <w:t>Scope:</w:t>
-      </w:r>
-      <w:r>
-        <w:rPr>
-          <w:b w:val="0"/>
-          <w:i w:val="0"/>
-          <w:sz w:val="20"/>
-        </w:rPr>
-        <w:t xml:space="preserve"> no cue → sentence kept unchanged. Cue in a subordinate clause → only that clause is removed. Cue in the main clause or a severe reveal → the sentence is rewritten.</w:t>
-      </w:r>
-    </w:p>
-    <w:p>
-      <w:pPr>
-        <w:pStyle w:val="ListBullet"/>
-        <w:spacing w:after="20"/>
-        <w:ind w:left="312"/>
-      </w:pPr>
-      <w:r>
-        <w:rPr>
-          <w:b/>
-          <w:i w:val="0"/>
-          <w:sz w:val="20"/>
-        </w:rPr>
-        <w:t>Rewrite:</w:t>
-      </w:r>
-      <w:r>
-        <w:rPr>
-          <w:b w:val="0"/>
-          <w:i w:val="0"/>
-          <w:sz w:val="20"/>
-        </w:rPr>
-        <w:t xml:space="preserve"> keep the reviewer's reaction and point it at a neutral phrase (“the big surprise”); if no opinion can be kept, use a neutral line chosen by spoiler type (ending, climax, twist, fate). Lines are never repeated in one review, and consecutive spoilers are merged into one line.</w:t>
-      </w:r>
-    </w:p>
-    <w:p>
-      <w:pPr>
-        <w:pStyle w:val="ListBullet"/>
-        <w:spacing w:after="20"/>
-        <w:ind w:left="312"/>
-      </w:pPr>
-      <w:r>
-        <w:rPr>
-          <w:b/>
-          <w:i w:val="0"/>
-          <w:sz w:val="20"/>
-        </w:rPr>
-        <w:t>Safety check:</w:t>
-      </w:r>
-      <w:r>
-        <w:rPr>
-          <w:b w:val="0"/>
-          <w:i w:val="0"/>
-          <w:sz w:val="20"/>
-        </w:rPr>
-        <w:t xml:space="preserve"> the output is re-scanned for disclosure words and long copied runs of the source; if any are found, nothing is shown (the system fails closed).</w:t>
-      </w:r>
-    </w:p>
-    <w:p>
-      <w:pPr>
-        <w:spacing w:before="40"/>
-      </w:pPr>
-      <w:r>
-        <w:rPr>
-          <w:b/>
-          <w:i w:val="0"/>
-        </w:rPr>
-        <w:t>Design decisions.</w:t>
-      </w:r>
-      <w:r>
-        <w:rPr>
-          <w:b w:val="0"/>
-          <w:i w:val="0"/>
-        </w:rPr>
-        <w:t xml:space="preserve"> A sentence-embedding “semantic” layer was built and then removed because it altered harmless sentences and raised memory from about 238 MB to 398 MB. An estimated review score was also removed, because it was only a guess from wording and not part of the task.</w:t>
-      </w:r>
-    </w:p>
-    <w:p>
-      <w:pPr>
-        <w:spacing w:after="40" w:before="100"/>
+        <w:keepNext/>
+        <w:spacing w:before="100" w:after="40"/>
         <w:pBdr>
           <w:bottom w:val="single" w:sz="4" w:space="1" w:color="1F3A5F"/>
         </w:pBdr>
@@ -581,25 +626,27 @@
           <w:color w:val="1F3A5F"/>
           <w:sz w:val="23"/>
         </w:rPr>
-        <w:t>4. Experimental results</w:t>
+        <w:t>5. Experimental Results</w:t>
       </w:r>
     </w:p>
     <w:p>
       <w:pPr>
-        <w:spacing w:after="60"/>
+        <w:spacing w:before="0"/>
       </w:pPr>
       <w:r>
         <w:rPr>
           <w:b w:val="0"/>
           <w:i w:val="0"/>
+          <w:sz w:val="19"/>
         </w:rPr>
-        <w:t>A script (</w:t>
+        <w:t xml:space="preserve">Tests were run with </w:t>
       </w:r>
       <w:r>
         <w:rPr>
           <w:rFonts w:ascii="Consolas" w:hAnsi="Consolas" w:eastAsia="Consolas"/>
           <w:b w:val="0"/>
           <w:i w:val="0"/>
+          <w:sz w:val="18"/>
         </w:rPr>
         <w:t>artifacts/measure.py</w:t>
       </w:r>
@@ -607,30 +654,9 @@
         <w:rPr>
           <w:b w:val="0"/>
           <w:i w:val="0"/>
+          <w:sz w:val="19"/>
         </w:rPr>
-        <w:t>) runs fixed test sets through the live pipeline. Each spoiler case is a harmless opening sentence followed by a spoiler; the test lists terms that must not appear in the output. Cases were written by the developer, so the results show the rules behave as designed, not accuracy on unseen reviews.</w:t>
-      </w:r>
-    </w:p>
-    <w:p>
-      <w:pPr>
-        <w:keepNext/>
-        <w:spacing w:after="40"/>
-      </w:pPr>
-      <w:r>
-        <w:rPr>
-          <w:b/>
-          <w:i/>
-          <w:sz w:val="18"/>
-        </w:rPr>
-        <w:t>Table 1.</w:t>
-      </w:r>
-      <w:r>
-        <w:rPr>
-          <w:b w:val="0"/>
-          <w:i/>
-          <w:sz w:val="18"/>
-        </w:rPr>
-        <w:t xml:space="preserve"> Measured results.</w:t>
+        <w:t>.</w:t>
       </w:r>
     </w:p>
     <w:tbl>
@@ -641,8 +667,8 @@
         <w:tblLook w:firstColumn="1" w:firstRow="1" w:lastColumn="0" w:lastRow="0" w:noHBand="0" w:noVBand="1" w:val="04A0"/>
       </w:tblPr>
       <w:tblGrid>
-        <w:gridCol w:w="4876"/>
-        <w:gridCol w:w="4876"/>
+        <w:gridCol w:w="4989"/>
+        <w:gridCol w:w="4989"/>
       </w:tblGrid>
       <w:tr>
         <w:trPr>
@@ -650,7 +676,7 @@
         </w:trPr>
         <w:tc>
           <w:tcPr>
-            <w:tcW w:type="dxa" w:w="6917"/>
+            <w:tcW w:type="dxa" w:w="7143"/>
             <w:shd w:val="clear" w:color="auto" w:fill="DCE6F1"/>
           </w:tcPr>
           <w:p>
@@ -697,7 +723,7 @@
         </w:trPr>
         <w:tc>
           <w:tcPr>
-            <w:tcW w:type="dxa" w:w="6917"/>
+            <w:tcW w:type="dxa" w:w="7143"/>
           </w:tcPr>
           <w:p>
             <w:pPr>
@@ -711,113 +737,7 @@
                 <w:i w:val="0"/>
                 <w:sz w:val="18"/>
               </w:rPr>
-              <w:t>Spoiler sentences tested / leaked into output</w:t>
-            </w:r>
-          </w:p>
-        </w:tc>
-        <w:tc>
-          <w:tcPr>
-            <w:tcW w:type="dxa" w:w="2835"/>
-          </w:tcPr>
-          <w:p>
-            <w:pPr>
-              <w:keepNext/>
-              <w:spacing w:after="0"/>
-            </w:pPr>
-            <w:r/>
-            <w:r>
-              <w:rPr>
-                <w:b w:val="0"/>
-                <w:i w:val="0"/>
-                <w:sz w:val="18"/>
-              </w:rPr>
-              <w:t xml:space="preserve">25 / </w:t>
-            </w:r>
-            <w:r>
-              <w:rPr>
-                <w:b/>
-                <w:i w:val="0"/>
-                <w:sz w:val="18"/>
-              </w:rPr>
-              <w:t>0</w:t>
-            </w:r>
-          </w:p>
-        </w:tc>
-      </w:tr>
-      <w:tr>
-        <w:trPr>
-          <w:cantSplit/>
-        </w:trPr>
-        <w:tc>
-          <w:tcPr>
-            <w:tcW w:type="dxa" w:w="6917"/>
-          </w:tcPr>
-          <w:p>
-            <w:pPr>
-              <w:keepNext/>
-              <w:spacing w:after="0"/>
-            </w:pPr>
-            <w:r/>
-            <w:r>
-              <w:rPr>
-                <w:b w:val="0"/>
-                <w:i w:val="0"/>
-                <w:sz w:val="18"/>
-              </w:rPr>
-              <w:t>Harmless sentences tested / changed or blocked</w:t>
-            </w:r>
-          </w:p>
-        </w:tc>
-        <w:tc>
-          <w:tcPr>
-            <w:tcW w:type="dxa" w:w="2835"/>
-          </w:tcPr>
-          <w:p>
-            <w:pPr>
-              <w:keepNext/>
-              <w:spacing w:after="0"/>
-            </w:pPr>
-            <w:r/>
-            <w:r>
-              <w:rPr>
-                <w:b w:val="0"/>
-                <w:i w:val="0"/>
-                <w:sz w:val="18"/>
-              </w:rPr>
-              <w:t xml:space="preserve">20 / </w:t>
-            </w:r>
-            <w:r>
-              <w:rPr>
-                <w:b/>
-                <w:i w:val="0"/>
-                <w:sz w:val="18"/>
-              </w:rPr>
-              <w:t>0</w:t>
-            </w:r>
-          </w:p>
-        </w:tc>
-      </w:tr>
-      <w:tr>
-        <w:trPr>
-          <w:cantSplit/>
-        </w:trPr>
-        <w:tc>
-          <w:tcPr>
-            <w:tcW w:type="dxa" w:w="6917"/>
-          </w:tcPr>
-          <w:p>
-            <w:pPr>
-              <w:keepNext/>
-              <w:spacing w:after="0"/>
-            </w:pPr>
-            <w:r/>
-            <w:r>
-              <w:rPr>
-                <w:b w:val="0"/>
-                <w:i w:val="0"/>
-                <w:sz w:val="18"/>
-              </w:rPr>
-              <w:t>Mixed reviews (harmless + spoiler + harmless): harmless sentences kept intact</w:t>
+              <w:t>Spoiler sentences leaked</w:t>
             </w:r>
           </w:p>
         </w:tc>
@@ -837,7 +757,7 @@
                 <w:i w:val="0"/>
                 <w:sz w:val="18"/>
               </w:rPr>
-              <w:t>48 of 48</w:t>
+              <w:t>12 of 191</w:t>
             </w:r>
           </w:p>
         </w:tc>
@@ -848,7 +768,7 @@
         </w:trPr>
         <w:tc>
           <w:tcPr>
-            <w:tcW w:type="dxa" w:w="6917"/>
+            <w:tcW w:type="dxa" w:w="7143"/>
           </w:tcPr>
           <w:p>
             <w:pPr>
@@ -862,7 +782,7 @@
                 <w:i w:val="0"/>
                 <w:sz w:val="18"/>
               </w:rPr>
-              <w:t>Whole review wrongly blocked</w:t>
+              <w:t>Harmless sentences changed or blocked</w:t>
             </w:r>
           </w:p>
         </w:tc>
@@ -878,11 +798,11 @@
             <w:r/>
             <w:r>
               <w:rPr>
-                <w:b w:val="0"/>
+                <w:b/>
                 <w:i w:val="0"/>
                 <w:sz w:val="18"/>
               </w:rPr>
-              <w:t>0</w:t>
+              <w:t>0 of 20</w:t>
             </w:r>
           </w:p>
         </w:tc>
@@ -893,7 +813,7 @@
         </w:trPr>
         <w:tc>
           <w:tcPr>
-            <w:tcW w:type="dxa" w:w="6917"/>
+            <w:tcW w:type="dxa" w:w="7143"/>
           </w:tcPr>
           <w:p>
             <w:pPr>
@@ -907,7 +827,52 @@
                 <w:i w:val="0"/>
                 <w:sz w:val="18"/>
               </w:rPr>
-              <w:t>Latency, short review (about 2 sentences): median / 95th percentile</w:t>
+              <w:t>Mixed reviews (harmless sentence, spoiler, harmless sentence) with surrounding harmless sentences intact</w:t>
+            </w:r>
+          </w:p>
+        </w:tc>
+        <w:tc>
+          <w:tcPr>
+            <w:tcW w:type="dxa" w:w="2835"/>
+          </w:tcPr>
+          <w:p>
+            <w:pPr>
+              <w:keepNext/>
+              <w:spacing w:after="0"/>
+            </w:pPr>
+            <w:r/>
+            <w:r>
+              <w:rPr>
+                <w:b/>
+                <w:i w:val="0"/>
+                <w:sz w:val="18"/>
+              </w:rPr>
+              <w:t>176 of 200</w:t>
+            </w:r>
+          </w:p>
+        </w:tc>
+      </w:tr>
+      <w:tr>
+        <w:trPr>
+          <w:cantSplit/>
+        </w:trPr>
+        <w:tc>
+          <w:tcPr>
+            <w:tcW w:type="dxa" w:w="7143"/>
+          </w:tcPr>
+          <w:p>
+            <w:pPr>
+              <w:keepNext/>
+              <w:spacing w:after="0"/>
+            </w:pPr>
+            <w:r/>
+            <w:r>
+              <w:rPr>
+                <w:b w:val="0"/>
+                <w:i w:val="0"/>
+                <w:sz w:val="18"/>
+              </w:rPr>
+              <w:t>Latency, short review (median)</w:t>
             </w:r>
           </w:p>
         </w:tc>
@@ -938,7 +903,7 @@
         </w:trPr>
         <w:tc>
           <w:tcPr>
-            <w:tcW w:type="dxa" w:w="6917"/>
+            <w:tcW w:type="dxa" w:w="7143"/>
           </w:tcPr>
           <w:p>
             <w:pPr>
@@ -952,7 +917,7 @@
                 <w:i w:val="0"/>
                 <w:sz w:val="18"/>
               </w:rPr>
-              <w:t>Latency, 297-word review: median / maximum</w:t>
+              <w:t>Latency, 297-word review (median / max)</w:t>
             </w:r>
           </w:p>
         </w:tc>
@@ -983,52 +948,7 @@
         </w:trPr>
         <w:tc>
           <w:tcPr>
-            <w:tcW w:type="dxa" w:w="6917"/>
-          </w:tcPr>
-          <w:p>
-            <w:pPr>
-              <w:keepNext/>
-              <w:spacing w:after="0"/>
-            </w:pPr>
-            <w:r/>
-            <w:r>
-              <w:rPr>
-                <w:b w:val="0"/>
-                <w:i w:val="0"/>
-                <w:sz w:val="18"/>
-              </w:rPr>
-              <w:t>Automated tests passing</w:t>
-            </w:r>
-          </w:p>
-        </w:tc>
-        <w:tc>
-          <w:tcPr>
-            <w:tcW w:type="dxa" w:w="2835"/>
-          </w:tcPr>
-          <w:p>
-            <w:pPr>
-              <w:keepNext/>
-              <w:spacing w:after="0"/>
-            </w:pPr>
-            <w:r/>
-            <w:r>
-              <w:rPr>
-                <w:b w:val="0"/>
-                <w:i w:val="0"/>
-                <w:sz w:val="18"/>
-              </w:rPr>
-              <w:t>212 of 212</w:t>
-            </w:r>
-          </w:p>
-        </w:tc>
-      </w:tr>
-      <w:tr>
-        <w:trPr>
-          <w:cantSplit/>
-        </w:trPr>
-        <w:tc>
-          <w:tcPr>
-            <w:tcW w:type="dxa" w:w="6917"/>
+            <w:tcW w:type="dxa" w:w="7143"/>
           </w:tcPr>
           <w:p>
             <w:pPr>
@@ -1041,24 +961,7 @@
                 <w:i w:val="0"/>
                 <w:sz w:val="18"/>
               </w:rPr>
-              <w:t>Earlier aspect-sentiment component (</w:t>
-            </w:r>
-            <w:r>
-              <w:rPr>
-                <w:rFonts w:ascii="Consolas" w:hAnsi="Consolas" w:eastAsia="Consolas"/>
-                <w:b w:val="0"/>
-                <w:i w:val="0"/>
-                <w:sz w:val="17"/>
-              </w:rPr>
-              <w:t>evaluate.py</w:t>
-            </w:r>
-            <w:r>
-              <w:rPr>
-                <w:b w:val="0"/>
-                <w:i w:val="0"/>
-                <w:sz w:val="18"/>
-              </w:rPr>
-              <w:t>, 26 synthetic examples)</w:t>
+              <w:t>All tests</w:t>
             </w:r>
           </w:p>
         </w:tc>
@@ -1077,7 +980,7 @@
                 <w:i w:val="0"/>
                 <w:sz w:val="18"/>
               </w:rPr>
-              <w:t>spoiler accuracy 0.92; sentiment accuracy 0.89</w:t>
+              <w:t>removes most of the spoilers while it may still leave out on something</w:t>
             </w:r>
           </w:p>
         </w:tc>
@@ -1090,24 +993,309 @@
     </w:p>
     <w:p>
       <w:pPr>
-        <w:keepNext/>
-        <w:spacing w:after="40"/>
+        <w:spacing w:before="0"/>
       </w:pPr>
       <w:r>
         <w:rPr>
           <w:b/>
-          <w:i/>
-          <w:sz w:val="18"/>
+          <w:i w:val="0"/>
+          <w:sz w:val="19"/>
         </w:rPr>
-        <w:t>Table 2.</w:t>
+        <w:t>Cases that were not caught.</w:t>
       </w:r>
       <w:r>
         <w:rPr>
           <w:b w:val="0"/>
-          <w:i/>
+          <w:i w:val="0"/>
+          <w:sz w:val="19"/>
+        </w:rPr>
+        <w:t xml:space="preserve">  A separate probe of tricky sentences (</w:t>
+      </w:r>
+      <w:r>
+        <w:rPr>
+          <w:rFonts w:ascii="Consolas" w:hAnsi="Consolas" w:eastAsia="Consolas"/>
+          <w:b w:val="0"/>
+          <w:i w:val="0"/>
           <w:sz w:val="18"/>
         </w:rPr>
-        <w:t xml:space="preserve"> Worked examples (actual outputs of the final system).</w:t>
+        <w:t>artifacts/probe_spoilers.py</w:t>
+      </w:r>
+      <w:r>
+        <w:rPr>
+          <w:b w:val="0"/>
+          <w:i w:val="0"/>
+          <w:sz w:val="19"/>
+        </w:rPr>
+        <w:t>) and the 212 automated tests also pass. so unusual phrasings, sarcasm and implied spoilers that no rule covers can still slip through.</w:t>
+      </w:r>
+    </w:p>
+    <w:p>
+      <w:pPr>
+        <w:keepNext/>
+        <w:spacing w:before="100" w:after="40"/>
+        <w:pBdr>
+          <w:bottom w:val="single" w:sz="4" w:space="1" w:color="1F3A5F"/>
+        </w:pBdr>
+      </w:pPr>
+      <w:r>
+        <w:rPr>
+          <w:b/>
+          <w:i w:val="0"/>
+          <w:color w:val="1F3A5F"/>
+          <w:sz w:val="23"/>
+        </w:rPr>
+        <w:t>6. Data Source</w:t>
+      </w:r>
+    </w:p>
+    <w:p>
+      <w:pPr>
+        <w:spacing w:before="0" w:after="20"/>
+        <w:ind w:left="397" w:hanging="255"/>
+      </w:pPr>
+      <w:r>
+        <w:rPr>
+          <w:b w:val="0"/>
+          <w:i w:val="0"/>
+          <w:sz w:val="19"/>
+        </w:rPr>
+        <w:t>•</w:t>
+        <w:tab/>
+      </w:r>
+      <w:r>
+        <w:rPr>
+          <w:b/>
+          <w:i w:val="0"/>
+          <w:sz w:val="19"/>
+        </w:rPr>
+        <w:t>User-supplied reviews:</w:t>
+      </w:r>
+      <w:r>
+        <w:rPr>
+          <w:b w:val="0"/>
+          <w:i w:val="0"/>
+          <w:sz w:val="19"/>
+        </w:rPr>
+        <w:t xml:space="preserve"> the text pasted into the page (</w:t>
+      </w:r>
+      <w:r>
+        <w:rPr>
+          <w:rFonts w:ascii="Consolas" w:hAnsi="Consolas" w:eastAsia="Consolas"/>
+          <w:b w:val="0"/>
+          <w:i w:val="0"/>
+          <w:sz w:val="18"/>
+        </w:rPr>
+        <w:t>data/sample_reviews.csv</w:t>
+      </w:r>
+      <w:r>
+        <w:rPr>
+          <w:b w:val="0"/>
+          <w:i w:val="0"/>
+          <w:sz w:val="19"/>
+        </w:rPr>
+        <w:t xml:space="preserve"> is a sample). Reviews are processed in memory and are not stored.</w:t>
+      </w:r>
+    </w:p>
+    <w:p>
+      <w:pPr>
+        <w:spacing w:before="0" w:after="20"/>
+        <w:ind w:left="397" w:hanging="255"/>
+      </w:pPr>
+      <w:r>
+        <w:rPr>
+          <w:b w:val="0"/>
+          <w:i w:val="0"/>
+          <w:sz w:val="19"/>
+        </w:rPr>
+        <w:t>•</w:t>
+        <w:tab/>
+      </w:r>
+      <w:r>
+        <w:rPr>
+          <w:b/>
+          <w:i w:val="0"/>
+          <w:sz w:val="19"/>
+        </w:rPr>
+        <w:t>Evaluation data:</w:t>
+      </w:r>
+      <w:r>
+        <w:rPr>
+          <w:b w:val="0"/>
+          <w:i w:val="0"/>
+          <w:sz w:val="19"/>
+        </w:rPr>
+        <w:t xml:space="preserve"> </w:t>
+      </w:r>
+      <w:r>
+        <w:rPr>
+          <w:rFonts w:ascii="Consolas" w:hAnsi="Consolas" w:eastAsia="Consolas"/>
+          <w:b w:val="0"/>
+          <w:i w:val="0"/>
+          <w:sz w:val="18"/>
+        </w:rPr>
+        <w:t>data/evaluation_examples.json</w:t>
+      </w:r>
+      <w:r>
+        <w:rPr>
+          <w:b w:val="0"/>
+          <w:i w:val="0"/>
+          <w:sz w:val="19"/>
+        </w:rPr>
+        <w:t xml:space="preserve"> (26 synthetic labelled sentences) and the general cases in </w:t>
+      </w:r>
+      <w:r>
+        <w:rPr>
+          <w:rFonts w:ascii="Consolas" w:hAnsi="Consolas" w:eastAsia="Consolas"/>
+          <w:b w:val="0"/>
+          <w:i w:val="0"/>
+          <w:sz w:val="18"/>
+        </w:rPr>
+        <w:t>artifacts/measure.py</w:t>
+      </w:r>
+      <w:r>
+        <w:rPr>
+          <w:b w:val="0"/>
+          <w:i w:val="0"/>
+          <w:sz w:val="19"/>
+        </w:rPr>
+        <w:t>.</w:t>
+      </w:r>
+    </w:p>
+    <w:p>
+      <w:pPr>
+        <w:spacing w:before="0" w:after="20"/>
+        <w:ind w:left="397" w:hanging="255"/>
+      </w:pPr>
+      <w:r>
+        <w:rPr>
+          <w:b w:val="0"/>
+          <w:i w:val="0"/>
+          <w:sz w:val="19"/>
+        </w:rPr>
+        <w:t>•</w:t>
+        <w:tab/>
+      </w:r>
+      <w:r>
+        <w:rPr>
+          <w:b/>
+          <w:i w:val="0"/>
+          <w:sz w:val="19"/>
+        </w:rPr>
+        <w:t>External public datasets :</w:t>
+      </w:r>
+    </w:p>
+    <w:p>
+      <w:pPr>
+        <w:spacing w:before="0" w:after="20"/>
+        <w:ind w:left="794" w:hanging="255"/>
+      </w:pPr>
+      <w:r>
+        <w:rPr>
+          <w:b w:val="0"/>
+          <w:i w:val="0"/>
+          <w:sz w:val="19"/>
+        </w:rPr>
+        <w:t>–</w:t>
+        <w:tab/>
+        <w:t>Kaggle, "IMDB Spoiler Dataset" (Misra): IMDb reviews labelled as spoiler or not.</w:t>
+      </w:r>
+    </w:p>
+    <w:p>
+      <w:pPr>
+        <w:spacing w:before="0" w:after="20"/>
+        <w:ind w:left="794" w:hanging="255"/>
+      </w:pPr>
+      <w:r>
+        <w:rPr>
+          <w:b w:val="0"/>
+          <w:i w:val="0"/>
+          <w:sz w:val="19"/>
+        </w:rPr>
+        <w:t>–</w:t>
+        <w:tab/>
+        <w:t xml:space="preserve">Hugging Face, </w:t>
+      </w:r>
+      <w:r>
+        <w:rPr>
+          <w:rFonts w:ascii="Consolas" w:hAnsi="Consolas" w:eastAsia="Consolas"/>
+          <w:b w:val="0"/>
+          <w:i w:val="0"/>
+          <w:sz w:val="18"/>
+        </w:rPr>
+        <w:t>stanfordnlp/imdb</w:t>
+      </w:r>
+      <w:r>
+        <w:rPr>
+          <w:b w:val="0"/>
+          <w:i w:val="0"/>
+          <w:sz w:val="19"/>
+        </w:rPr>
+        <w:t>: 50,000 labelled movie reviews, usable as realistic input text.</w:t>
+      </w:r>
+    </w:p>
+    <w:p>
+      <w:pPr>
+        <w:spacing w:before="0" w:after="20"/>
+        <w:ind w:left="397" w:hanging="255"/>
+      </w:pPr>
+      <w:r>
+        <w:rPr>
+          <w:b w:val="0"/>
+          <w:i w:val="0"/>
+          <w:sz w:val="19"/>
+        </w:rPr>
+        <w:t>•</w:t>
+        <w:tab/>
+      </w:r>
+      <w:r>
+        <w:rPr>
+          <w:b/>
+          <w:i w:val="0"/>
+          <w:sz w:val="19"/>
+        </w:rPr>
+        <w:t>Pretrained models:</w:t>
+      </w:r>
+      <w:r>
+        <w:rPr>
+          <w:b w:val="0"/>
+          <w:i w:val="0"/>
+          <w:sz w:val="19"/>
+        </w:rPr>
+        <w:t xml:space="preserve"> spaCy </w:t>
+      </w:r>
+      <w:r>
+        <w:rPr>
+          <w:rFonts w:ascii="Consolas" w:hAnsi="Consolas" w:eastAsia="Consolas"/>
+          <w:b w:val="0"/>
+          <w:i w:val="0"/>
+          <w:sz w:val="18"/>
+        </w:rPr>
+        <w:t>en_core_web_sm</w:t>
+      </w:r>
+      <w:r>
+        <w:rPr>
+          <w:b w:val="0"/>
+          <w:i w:val="0"/>
+          <w:sz w:val="19"/>
+        </w:rPr>
+        <w:t xml:space="preserve"> and the VADER lexicon.</w:t>
+      </w:r>
+    </w:p>
+    <w:p>
+      <w:pPr>
+        <w:keepNext/>
+        <w:spacing w:before="100" w:after="40"/>
+        <w:pBdr>
+          <w:bottom w:val="single" w:sz="4" w:space="1" w:color="1F3A5F"/>
+        </w:pBdr>
+      </w:pPr>
+      <w:r>
+        <w:rPr>
+          <w:b/>
+          <w:i w:val="0"/>
+          <w:color w:val="1F3A5F"/>
+          <w:sz w:val="23"/>
+        </w:rPr>
+        <w:t>7. Project Files</w:t>
       </w:r>
     </w:p>
     <w:tbl>
@@ -1118,8 +1306,8 @@
         <w:tblLook w:firstColumn="1" w:firstRow="1" w:lastColumn="0" w:lastRow="0" w:noHBand="0" w:noVBand="1" w:val="04A0"/>
       </w:tblPr>
       <w:tblGrid>
-        <w:gridCol w:w="4876"/>
-        <w:gridCol w:w="4876"/>
+        <w:gridCol w:w="4989"/>
+        <w:gridCol w:w="4989"/>
       </w:tblGrid>
       <w:tr>
         <w:trPr>
@@ -1127,7 +1315,7 @@
         </w:trPr>
         <w:tc>
           <w:tcPr>
-            <w:tcW w:type="dxa" w:w="4876"/>
+            <w:tcW w:type="dxa" w:w="2948"/>
             <w:shd w:val="clear" w:color="auto" w:fill="DCE6F1"/>
           </w:tcPr>
           <w:p>
@@ -1140,15 +1328,15 @@
               <w:rPr>
                 <w:b/>
                 <w:i w:val="0"/>
-                <w:sz w:val="17"/>
+                <w:sz w:val="18"/>
               </w:rPr>
-              <w:t>Input</w:t>
+              <w:t>File</w:t>
             </w:r>
           </w:p>
         </w:tc>
         <w:tc>
           <w:tcPr>
-            <w:tcW w:type="dxa" w:w="4876"/>
+            <w:tcW w:type="dxa" w:w="7030"/>
             <w:shd w:val="clear" w:color="auto" w:fill="DCE6F1"/>
           </w:tcPr>
           <w:p>
@@ -1161,9 +1349,9 @@
               <w:rPr>
                 <w:b/>
                 <w:i w:val="0"/>
-                <w:sz w:val="17"/>
+                <w:sz w:val="18"/>
               </w:rPr>
-              <w:t>Output</w:t>
+              <w:t>Purpose</w:t>
             </w:r>
           </w:p>
         </w:tc>
@@ -1174,7 +1362,28 @@
         </w:trPr>
         <w:tc>
           <w:tcPr>
-            <w:tcW w:type="dxa" w:w="4876"/>
+            <w:tcW w:type="dxa" w:w="2948"/>
+          </w:tcPr>
+          <w:p>
+            <w:pPr>
+              <w:keepNext/>
+              <w:spacing w:after="0"/>
+            </w:pPr>
+            <w:r/>
+            <w:r>
+              <w:rPr>
+                <w:rFonts w:ascii="Consolas" w:hAnsi="Consolas" w:eastAsia="Consolas"/>
+                <w:b w:val="0"/>
+                <w:i w:val="0"/>
+                <w:sz w:val="17"/>
+              </w:rPr>
+              <w:t>app.py</w:t>
+            </w:r>
+          </w:p>
+        </w:tc>
+        <w:tc>
+          <w:tcPr>
+            <w:tcW w:type="dxa" w:w="7030"/>
           </w:tcPr>
           <w:p>
             <w:pPr>
@@ -1186,15 +1395,41 @@
               <w:rPr>
                 <w:b w:val="0"/>
                 <w:i w:val="0"/>
+                <w:sz w:val="18"/>
+              </w:rPr>
+              <w:t>Flask web app: serves the page and the review-analysis API</w:t>
+            </w:r>
+          </w:p>
+        </w:tc>
+      </w:tr>
+      <w:tr>
+        <w:trPr>
+          <w:cantSplit/>
+        </w:trPr>
+        <w:tc>
+          <w:tcPr>
+            <w:tcW w:type="dxa" w:w="2948"/>
+          </w:tcPr>
+          <w:p>
+            <w:pPr>
+              <w:keepNext/>
+              <w:spacing w:after="0"/>
+            </w:pPr>
+            <w:r/>
+            <w:r>
+              <w:rPr>
+                <w:rFonts w:ascii="Consolas" w:hAnsi="Consolas" w:eastAsia="Consolas"/>
+                <w:b w:val="0"/>
+                <w:i w:val="0"/>
                 <w:sz w:val="17"/>
               </w:rPr>
-              <w:t>The acting is superb. Darth Vader is Luke's father, and that scene still gives me chills. The pacing is tight.</w:t>
+              <w:t>pipeline.py</w:t>
             </w:r>
           </w:p>
         </w:tc>
         <w:tc>
           <w:tcPr>
-            <w:tcW w:type="dxa" w:w="4876"/>
+            <w:tcW w:type="dxa" w:w="7030"/>
           </w:tcPr>
           <w:p>
             <w:pPr>
@@ -1206,9 +1441,9 @@
               <w:rPr>
                 <w:b w:val="0"/>
                 <w:i w:val="0"/>
-                <w:sz w:val="17"/>
+                <w:sz w:val="18"/>
               </w:rPr>
-              <w:t>The acting is superb. The big surprise still gives me chills. The pacing is tight.</w:t>
+              <w:t>Core NLP: spoiler detection, rewriting, aspect sentiment, sentence selection, safety check</w:t>
             </w:r>
           </w:p>
         </w:tc>
@@ -1219,7 +1454,28 @@
         </w:trPr>
         <w:tc>
           <w:tcPr>
-            <w:tcW w:type="dxa" w:w="4876"/>
+            <w:tcW w:type="dxa" w:w="2948"/>
+          </w:tcPr>
+          <w:p>
+            <w:pPr>
+              <w:keepNext/>
+              <w:spacing w:after="0"/>
+            </w:pPr>
+            <w:r/>
+            <w:r>
+              <w:rPr>
+                <w:rFonts w:ascii="Consolas" w:hAnsi="Consolas" w:eastAsia="Consolas"/>
+                <w:b w:val="0"/>
+                <w:i w:val="0"/>
+                <w:sz w:val="17"/>
+              </w:rPr>
+              <w:t>source_writer.py</w:t>
+            </w:r>
+          </w:p>
+        </w:tc>
+        <w:tc>
+          <w:tcPr>
+            <w:tcW w:type="dxa" w:w="7030"/>
           </w:tcPr>
           <w:p>
             <w:pPr>
@@ -1231,15 +1487,41 @@
               <w:rPr>
                 <w:b w:val="0"/>
                 <w:i w:val="0"/>
+                <w:sz w:val="18"/>
+              </w:rPr>
+              <w:t>Builds the reader-facing text from opinions using dependency parsing</w:t>
+            </w:r>
+          </w:p>
+        </w:tc>
+      </w:tr>
+      <w:tr>
+        <w:trPr>
+          <w:cantSplit/>
+        </w:trPr>
+        <w:tc>
+          <w:tcPr>
+            <w:tcW w:type="dxa" w:w="2948"/>
+          </w:tcPr>
+          <w:p>
+            <w:pPr>
+              <w:keepNext/>
+              <w:spacing w:after="0"/>
+            </w:pPr>
+            <w:r/>
+            <w:r>
+              <w:rPr>
+                <w:rFonts w:ascii="Consolas" w:hAnsi="Consolas" w:eastAsia="Consolas"/>
+                <w:b w:val="0"/>
+                <w:i w:val="0"/>
                 <w:sz w:val="17"/>
               </w:rPr>
-              <w:t>Fun ride. Turns out the mentor was the villain, which I didn't see coming.</w:t>
+              <w:t>serve.py</w:t>
             </w:r>
           </w:p>
         </w:tc>
         <w:tc>
           <w:tcPr>
-            <w:tcW w:type="dxa" w:w="4876"/>
+            <w:tcW w:type="dxa" w:w="7030"/>
           </w:tcPr>
           <w:p>
             <w:pPr>
@@ -1251,9 +1533,9 @@
               <w:rPr>
                 <w:b w:val="0"/>
                 <w:i w:val="0"/>
-                <w:sz w:val="17"/>
+                <w:sz w:val="18"/>
               </w:rPr>
-              <w:t>Fun ride. I didn't see the big surprise coming.</w:t>
+              <w:t>Production entry point (Waitress)</w:t>
             </w:r>
           </w:p>
         </w:tc>
@@ -1264,7 +1546,28 @@
         </w:trPr>
         <w:tc>
           <w:tcPr>
-            <w:tcW w:type="dxa" w:w="4876"/>
+            <w:tcW w:type="dxa" w:w="2948"/>
+          </w:tcPr>
+          <w:p>
+            <w:pPr>
+              <w:keepNext/>
+              <w:spacing w:after="0"/>
+            </w:pPr>
+            <w:r/>
+            <w:r>
+              <w:rPr>
+                <w:rFonts w:ascii="Consolas" w:hAnsi="Consolas" w:eastAsia="Consolas"/>
+                <w:b w:val="0"/>
+                <w:i w:val="0"/>
+                <w:sz w:val="17"/>
+              </w:rPr>
+              <w:t>evaluate.py</w:t>
+            </w:r>
+          </w:p>
+        </w:tc>
+        <w:tc>
+          <w:tcPr>
+            <w:tcW w:type="dxa" w:w="7030"/>
           </w:tcPr>
           <w:p>
             <w:pPr>
@@ -1276,15 +1579,67 @@
               <w:rPr>
                 <w:b w:val="0"/>
                 <w:i w:val="0"/>
+                <w:sz w:val="18"/>
+              </w:rPr>
+              <w:t xml:space="preserve">Scores aspect sentiment on </w:t>
+            </w:r>
+            <w:r>
+              <w:rPr>
+                <w:rFonts w:ascii="Consolas" w:hAnsi="Consolas" w:eastAsia="Consolas"/>
+                <w:b w:val="0"/>
+                <w:i w:val="0"/>
                 <w:sz w:val="17"/>
               </w:rPr>
-              <w:t>The cast is superb and the songs are catchy. In the end the hero dies saving his village. The cinematography is gorgeous.</w:t>
+              <w:t>data/evaluation_examples.json</w:t>
+            </w:r>
+          </w:p>
+        </w:tc>
+      </w:tr>
+      <w:tr>
+        <w:trPr>
+          <w:cantSplit/>
+        </w:trPr>
+        <w:tc>
+          <w:tcPr>
+            <w:tcW w:type="dxa" w:w="2948"/>
+          </w:tcPr>
+          <w:p>
+            <w:pPr>
+              <w:keepNext/>
+              <w:spacing w:after="0"/>
+            </w:pPr>
+            <w:r/>
+            <w:r>
+              <w:rPr>
+                <w:rFonts w:ascii="Consolas" w:hAnsi="Consolas" w:eastAsia="Consolas"/>
+                <w:b w:val="0"/>
+                <w:i w:val="0"/>
+                <w:sz w:val="17"/>
+              </w:rPr>
+              <w:t>templates/index.html</w:t>
+            </w:r>
+            <w:r>
+              <w:rPr>
+                <w:b w:val="0"/>
+                <w:i w:val="0"/>
+                <w:sz w:val="18"/>
+              </w:rPr>
+              <w:t xml:space="preserve">, </w:t>
+            </w:r>
+            <w:r>
+              <w:rPr>
+                <w:rFonts w:ascii="Consolas" w:hAnsi="Consolas" w:eastAsia="Consolas"/>
+                <w:b w:val="0"/>
+                <w:i w:val="0"/>
+                <w:sz w:val="17"/>
+              </w:rPr>
+              <w:t>static/</w:t>
             </w:r>
           </w:p>
         </w:tc>
         <w:tc>
           <w:tcPr>
-            <w:tcW w:type="dxa" w:w="4876"/>
+            <w:tcW w:type="dxa" w:w="7030"/>
           </w:tcPr>
           <w:p>
             <w:pPr>
@@ -1296,9 +1651,9 @@
               <w:rPr>
                 <w:b w:val="0"/>
                 <w:i w:val="0"/>
-                <w:sz w:val="17"/>
+                <w:sz w:val="18"/>
               </w:rPr>
-              <w:t>The cast is superb and the songs are catchy. The ending is best experienced without knowing what's coming. The cinematography is gorgeous.</w:t>
+              <w:t>Front end: page, JavaScript, CSS, logo</w:t>
             </w:r>
           </w:p>
         </w:tc>
@@ -1309,7 +1664,28 @@
         </w:trPr>
         <w:tc>
           <w:tcPr>
-            <w:tcW w:type="dxa" w:w="4876"/>
+            <w:tcW w:type="dxa" w:w="2948"/>
+          </w:tcPr>
+          <w:p>
+            <w:pPr>
+              <w:keepNext/>
+              <w:spacing w:after="0"/>
+            </w:pPr>
+            <w:r/>
+            <w:r>
+              <w:rPr>
+                <w:rFonts w:ascii="Consolas" w:hAnsi="Consolas" w:eastAsia="Consolas"/>
+                <w:b w:val="0"/>
+                <w:i w:val="0"/>
+                <w:sz w:val="17"/>
+              </w:rPr>
+              <w:t>data/</w:t>
+            </w:r>
+          </w:p>
+        </w:tc>
+        <w:tc>
+          <w:tcPr>
+            <w:tcW w:type="dxa" w:w="7030"/>
           </w:tcPr>
           <w:p>
             <w:pPr>
@@ -1321,15 +1697,41 @@
               <w:rPr>
                 <w:b w:val="0"/>
                 <w:i w:val="0"/>
+                <w:sz w:val="18"/>
+              </w:rPr>
+              <w:t>Sample reviews, evaluation examples, catalog files</w:t>
+            </w:r>
+          </w:p>
+        </w:tc>
+      </w:tr>
+      <w:tr>
+        <w:trPr>
+          <w:cantSplit/>
+        </w:trPr>
+        <w:tc>
+          <w:tcPr>
+            <w:tcW w:type="dxa" w:w="2948"/>
+          </w:tcPr>
+          <w:p>
+            <w:pPr>
+              <w:keepNext/>
+              <w:spacing w:after="0"/>
+            </w:pPr>
+            <w:r/>
+            <w:r>
+              <w:rPr>
+                <w:rFonts w:ascii="Consolas" w:hAnsi="Consolas" w:eastAsia="Consolas"/>
+                <w:b w:val="0"/>
+                <w:i w:val="0"/>
                 <w:sz w:val="17"/>
               </w:rPr>
-              <w:t>The visual effects are stunning, but I hated that the main character dies at the end.</w:t>
+              <w:t>tests/</w:t>
             </w:r>
           </w:p>
         </w:tc>
         <w:tc>
           <w:tcPr>
-            <w:tcW w:type="dxa" w:w="4876"/>
+            <w:tcW w:type="dxa" w:w="7030"/>
           </w:tcPr>
           <w:p>
             <w:pPr>
@@ -1341,9 +1743,9 @@
               <w:rPr>
                 <w:b w:val="0"/>
                 <w:i w:val="0"/>
-                <w:sz w:val="17"/>
+                <w:sz w:val="18"/>
               </w:rPr>
-              <w:t>The visual effects are stunning.</w:t>
+              <w:t>212 automated tests</w:t>
             </w:r>
           </w:p>
         </w:tc>
@@ -1354,7 +1756,124 @@
         </w:trPr>
         <w:tc>
           <w:tcPr>
-            <w:tcW w:type="dxa" w:w="4876"/>
+            <w:tcW w:type="dxa" w:w="2948"/>
+          </w:tcPr>
+          <w:p>
+            <w:pPr>
+              <w:keepNext/>
+              <w:spacing w:after="0"/>
+            </w:pPr>
+            <w:r/>
+            <w:r>
+              <w:rPr>
+                <w:rFonts w:ascii="Consolas" w:hAnsi="Consolas" w:eastAsia="Consolas"/>
+                <w:b w:val="0"/>
+                <w:i w:val="0"/>
+                <w:sz w:val="17"/>
+              </w:rPr>
+              <w:t>artifacts/</w:t>
+            </w:r>
+          </w:p>
+        </w:tc>
+        <w:tc>
+          <w:tcPr>
+            <w:tcW w:type="dxa" w:w="7030"/>
+          </w:tcPr>
+          <w:p>
+            <w:pPr>
+              <w:keepNext/>
+              <w:spacing w:after="0"/>
+            </w:pPr>
+            <w:r/>
+            <w:r>
+              <w:rPr>
+                <w:b w:val="0"/>
+                <w:i w:val="0"/>
+                <w:sz w:val="18"/>
+              </w:rPr>
+              <w:t>Measurement and spoiler-probe scripts (</w:t>
+            </w:r>
+            <w:r>
+              <w:rPr>
+                <w:rFonts w:ascii="Consolas" w:hAnsi="Consolas" w:eastAsia="Consolas"/>
+                <w:b w:val="0"/>
+                <w:i w:val="0"/>
+                <w:sz w:val="17"/>
+              </w:rPr>
+              <w:t>measure.py</w:t>
+            </w:r>
+            <w:r>
+              <w:rPr>
+                <w:b w:val="0"/>
+                <w:i w:val="0"/>
+                <w:sz w:val="18"/>
+              </w:rPr>
+              <w:t xml:space="preserve">, </w:t>
+            </w:r>
+            <w:r>
+              <w:rPr>
+                <w:rFonts w:ascii="Consolas" w:hAnsi="Consolas" w:eastAsia="Consolas"/>
+                <w:b w:val="0"/>
+                <w:i w:val="0"/>
+                <w:sz w:val="17"/>
+              </w:rPr>
+              <w:t>probe_spoilers.py</w:t>
+            </w:r>
+            <w:r>
+              <w:rPr>
+                <w:b w:val="0"/>
+                <w:i w:val="0"/>
+                <w:sz w:val="18"/>
+              </w:rPr>
+              <w:t>)</w:t>
+            </w:r>
+          </w:p>
+        </w:tc>
+      </w:tr>
+      <w:tr>
+        <w:trPr>
+          <w:cantSplit/>
+        </w:trPr>
+        <w:tc>
+          <w:tcPr>
+            <w:tcW w:type="dxa" w:w="2948"/>
+          </w:tcPr>
+          <w:p>
+            <w:pPr>
+              <w:spacing w:after="0"/>
+            </w:pPr>
+            <w:r/>
+            <w:r>
+              <w:rPr>
+                <w:rFonts w:ascii="Consolas" w:hAnsi="Consolas" w:eastAsia="Consolas"/>
+                <w:b w:val="0"/>
+                <w:i w:val="0"/>
+                <w:sz w:val="17"/>
+              </w:rPr>
+              <w:t>requirements.txt</w:t>
+            </w:r>
+            <w:r>
+              <w:rPr>
+                <w:b w:val="0"/>
+                <w:i w:val="0"/>
+                <w:sz w:val="18"/>
+              </w:rPr>
+              <w:t xml:space="preserve">, </w:t>
+            </w:r>
+            <w:r>
+              <w:rPr>
+                <w:rFonts w:ascii="Consolas" w:hAnsi="Consolas" w:eastAsia="Consolas"/>
+                <w:b w:val="0"/>
+                <w:i w:val="0"/>
+                <w:sz w:val="17"/>
+              </w:rPr>
+              <w:t>.env.example</w:t>
+            </w:r>
+          </w:p>
+        </w:tc>
+        <w:tc>
+          <w:tcPr>
+            <w:tcW w:type="dxa" w:w="7030"/>
           </w:tcPr>
           <w:p>
             <w:pPr>
@@ -1365,28 +1884,9 @@
               <w:rPr>
                 <w:b w:val="0"/>
                 <w:i w:val="0"/>
-                <w:sz w:val="17"/>
+                <w:sz w:val="18"/>
               </w:rPr>
-              <w:t>A tense, gripping war drama with strong performances.</w:t>
-            </w:r>
-          </w:p>
-        </w:tc>
-        <w:tc>
-          <w:tcPr>
-            <w:tcW w:type="dxa" w:w="4876"/>
-          </w:tcPr>
-          <w:p>
-            <w:pPr>
-              <w:spacing w:after="0"/>
-            </w:pPr>
-            <w:r/>
-            <w:r>
-              <w:rPr>
-                <w:b w:val="0"/>
-                <w:i w:val="0"/>
-                <w:sz w:val="17"/>
-              </w:rPr>
-              <w:t>(unchanged: no spoiler)</w:t>
+              <w:t>Dependencies and settings template</w:t>
             </w:r>
           </w:p>
         </w:tc>
@@ -1397,403 +1897,9 @@
         <w:spacing w:after="20"/>
       </w:pPr>
     </w:p>
-    <w:p>
-      <w:pPr>
-        <w:spacing w:after="40"/>
-      </w:pPr>
-      <w:r>
-        <w:rPr>
-          <w:b/>
-          <w:i w:val="0"/>
-        </w:rPr>
-        <w:t>Finding.</w:t>
-      </w:r>
-      <w:r>
-        <w:rPr>
-          <w:b w:val="0"/>
-          <w:i w:val="0"/>
-        </w:rPr>
-        <w:t xml:space="preserve"> The first run of the 25-case set exposed one leak (“Amy faked her own disappearance to frame Nick”), although an earlier 16-case probe had shown none. The patterns were extended, a test was added, and the re-run gave 0 leaks. A real failure was also fixed: a pasted plot summary of </w:t>
-      </w:r>
-      <w:r>
-        <w:rPr>
-          <w:b w:val="0"/>
-          <w:i/>
-        </w:rPr>
-        <w:t>Devara: Part 1</w:t>
-      </w:r>
-      <w:r>
-        <w:rPr>
-          <w:b w:val="0"/>
-          <w:i w:val="0"/>
-        </w:rPr>
-        <w:t xml:space="preserve"> was blocked entirely because a rewrite produced “The big surprise is dead”; it now keeps the setup verbatim and replaces only the twist and ending.</w:t>
-      </w:r>
-    </w:p>
-    <w:p>
-      <w:r>
-        <w:rPr>
-          <w:b/>
-          <w:i w:val="0"/>
-        </w:rPr>
-        <w:t>Limitations.</w:t>
-      </w:r>
-      <w:r>
-        <w:rPr>
-          <w:b w:val="0"/>
-          <w:i w:val="0"/>
-        </w:rPr>
-        <w:t xml:space="preserve"> Rules cover only anticipated phrasings, so an unusual spoiler can pass; replacement lines are generic by design; only English is supported; and accuracy on real reviews is unknown until tested on an independent, labelled set (planned: 100 or more reviews, two annotators).</w:t>
-      </w:r>
-    </w:p>
-    <w:p>
-      <w:pPr>
-        <w:spacing w:after="40" w:before="100"/>
-        <w:pBdr>
-          <w:bottom w:val="single" w:sz="4" w:space="1" w:color="1F3A5F"/>
-        </w:pBdr>
-      </w:pPr>
-      <w:r>
-        <w:rPr>
-          <w:b/>
-          <w:i w:val="0"/>
-          <w:color w:val="1F3A5F"/>
-          <w:sz w:val="23"/>
-        </w:rPr>
-        <w:t>5. Data source</w:t>
-      </w:r>
-    </w:p>
-    <w:p>
-      <w:pPr>
-        <w:spacing w:after="20"/>
-      </w:pPr>
-      <w:r>
-        <w:rPr>
-          <w:b w:val="0"/>
-          <w:i w:val="0"/>
-        </w:rPr>
-        <w:t xml:space="preserve">The system uses </w:t>
-      </w:r>
-      <w:r>
-        <w:rPr>
-          <w:b/>
-          <w:i w:val="0"/>
-        </w:rPr>
-        <w:t>no training data</w:t>
-      </w:r>
-      <w:r>
-        <w:rPr>
-          <w:b w:val="0"/>
-          <w:i w:val="0"/>
-        </w:rPr>
-        <w:t>. Test and evaluation data are as follows.</w:t>
-      </w:r>
-    </w:p>
-    <w:p>
-      <w:pPr>
-        <w:pStyle w:val="ListBullet"/>
-        <w:spacing w:after="20"/>
-        <w:ind w:left="312"/>
-      </w:pPr>
-      <w:r>
-        <w:rPr>
-          <w:b/>
-          <w:i w:val="0"/>
-          <w:sz w:val="20"/>
-        </w:rPr>
-        <w:t>Test reviews and spoiler sentences:</w:t>
-      </w:r>
-      <w:r>
-        <w:rPr>
-          <w:b w:val="0"/>
-          <w:i w:val="0"/>
-          <w:sz w:val="20"/>
-        </w:rPr>
-        <w:t xml:space="preserve"> written by the developer, based on the plots of well-known films (for example </w:t>
-      </w:r>
-      <w:r>
-        <w:rPr>
-          <w:b w:val="0"/>
-          <w:i/>
-          <w:sz w:val="20"/>
-        </w:rPr>
-        <w:t>The Sixth Sense</w:t>
-      </w:r>
-      <w:r>
-        <w:rPr>
-          <w:b w:val="0"/>
-          <w:i w:val="0"/>
-          <w:sz w:val="20"/>
-        </w:rPr>
-        <w:t xml:space="preserve">, </w:t>
-      </w:r>
-      <w:r>
-        <w:rPr>
-          <w:b w:val="0"/>
-          <w:i/>
-          <w:sz w:val="20"/>
-        </w:rPr>
-        <w:t>Fight Club</w:t>
-      </w:r>
-      <w:r>
-        <w:rPr>
-          <w:b w:val="0"/>
-          <w:i w:val="0"/>
-          <w:sz w:val="20"/>
-        </w:rPr>
-        <w:t xml:space="preserve">, </w:t>
-      </w:r>
-      <w:r>
-        <w:rPr>
-          <w:b w:val="0"/>
-          <w:i/>
-          <w:sz w:val="20"/>
-        </w:rPr>
-        <w:t>Parasite</w:t>
-      </w:r>
-      <w:r>
-        <w:rPr>
-          <w:b w:val="0"/>
-          <w:i w:val="0"/>
-          <w:sz w:val="20"/>
-        </w:rPr>
-        <w:t xml:space="preserve">, </w:t>
-      </w:r>
-      <w:r>
-        <w:rPr>
-          <w:b w:val="0"/>
-          <w:i/>
-          <w:sz w:val="20"/>
-        </w:rPr>
-        <w:t>Gone Girl</w:t>
-      </w:r>
-      <w:r>
-        <w:rPr>
-          <w:b w:val="0"/>
-          <w:i w:val="0"/>
-          <w:sz w:val="20"/>
-        </w:rPr>
-        <w:t>) and on reviews that failed during use (</w:t>
-      </w:r>
-      <w:r>
-        <w:rPr>
-          <w:b w:val="0"/>
-          <w:i/>
-          <w:sz w:val="20"/>
-        </w:rPr>
-        <w:t>Jailer</w:t>
-      </w:r>
-      <w:r>
-        <w:rPr>
-          <w:b w:val="0"/>
-          <w:i w:val="0"/>
-          <w:sz w:val="20"/>
-        </w:rPr>
-        <w:t xml:space="preserve">, </w:t>
-      </w:r>
-      <w:r>
-        <w:rPr>
-          <w:b w:val="0"/>
-          <w:i/>
-          <w:sz w:val="20"/>
-        </w:rPr>
-        <w:t>Irumudi</w:t>
-      </w:r>
-      <w:r>
-        <w:rPr>
-          <w:b w:val="0"/>
-          <w:i w:val="0"/>
-          <w:sz w:val="20"/>
-        </w:rPr>
-        <w:t xml:space="preserve">, </w:t>
-      </w:r>
-      <w:r>
-        <w:rPr>
-          <w:b w:val="0"/>
-          <w:i/>
-          <w:sz w:val="20"/>
-        </w:rPr>
-        <w:t>Devara</w:t>
-      </w:r>
-      <w:r>
-        <w:rPr>
-          <w:b w:val="0"/>
-          <w:i w:val="0"/>
-          <w:sz w:val="20"/>
-        </w:rPr>
-        <w:t xml:space="preserve">). They live in </w:t>
-      </w:r>
-      <w:r>
-        <w:rPr>
-          <w:rFonts w:ascii="Consolas" w:hAnsi="Consolas" w:eastAsia="Consolas"/>
-          <w:b w:val="0"/>
-          <w:i w:val="0"/>
-          <w:sz w:val="20"/>
-        </w:rPr>
-        <w:t>tests/</w:t>
-      </w:r>
-      <w:r>
-        <w:rPr>
-          <w:b w:val="0"/>
-          <w:i w:val="0"/>
-          <w:sz w:val="20"/>
-        </w:rPr>
-        <w:t xml:space="preserve"> and </w:t>
-      </w:r>
-      <w:r>
-        <w:rPr>
-          <w:rFonts w:ascii="Consolas" w:hAnsi="Consolas" w:eastAsia="Consolas"/>
-          <w:b w:val="0"/>
-          <w:i w:val="0"/>
-          <w:sz w:val="20"/>
-        </w:rPr>
-        <w:t>artifacts/measure.py</w:t>
-      </w:r>
-      <w:r>
-        <w:rPr>
-          <w:b w:val="0"/>
-          <w:i w:val="0"/>
-          <w:sz w:val="20"/>
-        </w:rPr>
-        <w:t>.</w:t>
-      </w:r>
-    </w:p>
-    <w:p>
-      <w:pPr>
-        <w:pStyle w:val="ListBullet"/>
-        <w:spacing w:after="20"/>
-        <w:ind w:left="312"/>
-      </w:pPr>
-      <w:r>
-        <w:rPr>
-          <w:b/>
-          <w:i w:val="0"/>
-          <w:sz w:val="20"/>
-        </w:rPr>
-        <w:t>Evaluation file:</w:t>
-      </w:r>
-      <w:r>
-        <w:rPr>
-          <w:b w:val="0"/>
-          <w:i w:val="0"/>
-          <w:sz w:val="20"/>
-        </w:rPr>
-        <w:t xml:space="preserve"> </w:t>
-      </w:r>
-      <w:r>
-        <w:rPr>
-          <w:rFonts w:ascii="Consolas" w:hAnsi="Consolas" w:eastAsia="Consolas"/>
-          <w:b w:val="0"/>
-          <w:i w:val="0"/>
-          <w:sz w:val="20"/>
-        </w:rPr>
-        <w:t>data/evaluation_examples.json</w:t>
-      </w:r>
-      <w:r>
-        <w:rPr>
-          <w:b w:val="0"/>
-          <w:i w:val="0"/>
-          <w:sz w:val="20"/>
-        </w:rPr>
-        <w:t xml:space="preserve"> holds 26 short synthetic sentences used by </w:t>
-      </w:r>
-      <w:r>
-        <w:rPr>
-          <w:rFonts w:ascii="Consolas" w:hAnsi="Consolas" w:eastAsia="Consolas"/>
-          <w:b w:val="0"/>
-          <w:i w:val="0"/>
-          <w:sz w:val="20"/>
-        </w:rPr>
-        <w:t>evaluate.py</w:t>
-      </w:r>
-      <w:r>
-        <w:rPr>
-          <w:b w:val="0"/>
-          <w:i w:val="0"/>
-          <w:sz w:val="20"/>
-        </w:rPr>
-        <w:t>; it is a sanity check, not a benchmark.</w:t>
-      </w:r>
-    </w:p>
-    <w:p>
-      <w:pPr>
-        <w:pStyle w:val="ListBullet"/>
-        <w:spacing w:after="20"/>
-        <w:ind w:left="312"/>
-      </w:pPr>
-      <w:r>
-        <w:rPr>
-          <w:b/>
-          <w:i w:val="0"/>
-          <w:sz w:val="20"/>
-        </w:rPr>
-        <w:t>Libraries and lexicons:</w:t>
-      </w:r>
-      <w:r>
-        <w:rPr>
-          <w:b w:val="0"/>
-          <w:i w:val="0"/>
-          <w:sz w:val="20"/>
-        </w:rPr>
-        <w:t xml:space="preserve"> spaCy </w:t>
-      </w:r>
-      <w:r>
-        <w:rPr>
-          <w:rFonts w:ascii="Consolas" w:hAnsi="Consolas" w:eastAsia="Consolas"/>
-          <w:b w:val="0"/>
-          <w:i w:val="0"/>
-          <w:sz w:val="20"/>
-        </w:rPr>
-        <w:t>en_core_web_sm</w:t>
-      </w:r>
-      <w:r>
-        <w:rPr>
-          <w:b w:val="0"/>
-          <w:i w:val="0"/>
-          <w:sz w:val="20"/>
-        </w:rPr>
-        <w:t xml:space="preserve"> 3.8.0 (parser) and the VADER sentiment lexicon (published rule-based model, Hutto and Gilbert, 2014), both used unmodified except for a small added review vocabulary.</w:t>
-      </w:r>
-    </w:p>
-    <w:p>
-      <w:pPr>
-        <w:pStyle w:val="ListBullet"/>
-        <w:spacing w:after="20"/>
-        <w:ind w:left="312"/>
-      </w:pPr>
-      <w:r>
-        <w:rPr>
-          <w:b/>
-          <w:i w:val="0"/>
-          <w:sz w:val="20"/>
-        </w:rPr>
-        <w:t>User input:</w:t>
-      </w:r>
-      <w:r>
-        <w:rPr>
-          <w:b w:val="0"/>
-          <w:i w:val="0"/>
-          <w:sz w:val="20"/>
-        </w:rPr>
-        <w:t xml:space="preserve"> pasted reviews are processed in memory and are not stored by the pasted-review path.</w:t>
-      </w:r>
-    </w:p>
-    <w:p>
-      <w:pPr>
-        <w:spacing w:before="40"/>
-      </w:pPr>
-      <w:r>
-        <w:rPr>
-          <w:b w:val="0"/>
-          <w:i/>
-          <w:sz w:val="18"/>
-        </w:rPr>
-        <w:t>Source code, tests and the full 14-section report: https://github.com/tejeshwar20/clearcut</w:t>
-      </w:r>
-    </w:p>
     <w:sectPr>
       <w:pgSz w:w="11906" w:h="16838"/>
-      <w:pgMar w:top="850" w:right="1077" w:bottom="794" w:left="1077" w:header="720" w:footer="720" w:gutter="0"/>
+      <w:pgMar w:top="737" w:right="964" w:bottom="680" w:left="964" w:header="720" w:footer="720" w:gutter="0"/>
       <w:cols w:space="720"/>
       <w:docGrid w:linePitch="360"/>
     </w:sectPr>
@@ -2165,11 +2271,11 @@
     <w:qFormat/>
     <w:rsid w:val="00FC693F"/>
     <w:pPr>
-      <w:spacing w:after="60" w:before="0" w:line="240" w:lineRule="auto"/>
+      <w:spacing w:after="50" w:before="0" w:line="240" w:lineRule="auto"/>
     </w:pPr>
     <w:rPr>
       <w:rFonts w:ascii="Calibri" w:hAnsi="Calibri" w:eastAsia="Calibri"/>
-      <w:sz w:val="20"/>
+      <w:sz w:val="19"/>
     </w:rPr>
   </w:style>
   <w:style w:type="paragraph" w:styleId="Header">

</xml_diff>